<commit_message>
Fix Apps Script logout and preserve exact ministry template slots and signatures
</commit_message>
<xml_diff>
--- a/LY_LICH_KHOA_HOC_MAU_CUA_BO.docx
+++ b/LY_LICH_KHOA_HOC_MAU_CUA_BO.docx
@@ -73,7 +73,7 @@
         <mc:AlternateContent>
           <mc:Choice Requires="wps">
             <w:drawing>
-              <wp:anchor behindDoc="0" distT="0" distB="0" distL="114935" distR="114935" simplePos="0" locked="0" layoutInCell="1" allowOverlap="1" relativeHeight="4">
+              <wp:anchor distT="0" distB="0" distL="114935" distR="114935" simplePos="0" relativeHeight="4" behindDoc="0" locked="0" layoutInCell="1" allowOverlap="1">
                 <wp:simplePos x="0" y="0"/>
                 <wp:positionH relativeFrom="column">
                   <wp:posOffset>1905000</wp:posOffset>
@@ -159,7 +159,6 @@
         <w:rPr>
           <w:rFonts w:ascii="Times New Roman" w:hAnsi="Times New Roman" w:cs="Times New Roman"/>
           <w:i/>
-          <w:i/>
           <w:sz w:val="20"/>
           <w:szCs w:val="20"/>
           <w:lang w:val="de-DE"/>
@@ -182,7 +181,6 @@
         <w:rPr>
           <w:rFonts w:ascii="Times New Roman" w:hAnsi="Times New Roman" w:cs="Times New Roman"/>
           <w:b/>
-          <w:i/>
           <w:i/>
           <w:sz w:val="30"/>
           <w:szCs w:val="20"/>
@@ -583,7 +581,7 @@
           <w:numId w:val="5"/>
         </w:numPr>
         <w:spacing w:lineRule="auto" w:line="336"/>
-        <w:ind w:hanging="0" w:left="0" w:right="0"/>
+        <w:ind w:hanging="0" w:start="0" w:end="0"/>
         <w:rPr>
           <w:rFonts w:ascii="Times New Roman" w:hAnsi="Times New Roman" w:cs="Times New Roman"/>
           <w:b/>
@@ -740,7 +738,7 @@
           <w:tab w:val="right" w:pos="9356" w:leader="dot"/>
         </w:tabs>
         <w:spacing w:lineRule="auto" w:line="336"/>
-        <w:ind w:hanging="0" w:left="0" w:right="0"/>
+        <w:ind w:hanging="0" w:start="0" w:end="0"/>
         <w:rPr>
           <w:rFonts w:ascii="Times New Roman" w:hAnsi="Times New Roman" w:cs="Times New Roman"/>
           <w:b/>
@@ -771,7 +769,7 @@
           <w:tab w:val="right" w:pos="9356" w:leader="dot"/>
         </w:tabs>
         <w:spacing w:lineRule="auto" w:line="336"/>
-        <w:ind w:hanging="0" w:left="0" w:right="0"/>
+        <w:ind w:hanging="0" w:start="0" w:end="0"/>
         <w:rPr>
           <w:rFonts w:ascii="Times New Roman" w:hAnsi="Times New Roman" w:cs="Times New Roman"/>
           <w:sz w:val="26"/>
@@ -798,7 +796,7 @@
           <w:tab w:val="right" w:pos="9356" w:leader="dot"/>
         </w:tabs>
         <w:spacing w:lineRule="auto" w:line="336"/>
-        <w:ind w:left="360" w:right="0"/>
+        <w:ind w:start="360" w:end="0"/>
         <w:rPr>
           <w:rFonts w:ascii="Times New Roman" w:hAnsi="Times New Roman" w:cs="Times New Roman"/>
           <w:sz w:val="26"/>
@@ -828,7 +826,7 @@
           <w:tab w:val="right" w:pos="9356" w:leader="dot"/>
         </w:tabs>
         <w:spacing w:lineRule="auto" w:line="336"/>
-        <w:ind w:hanging="0" w:left="0" w:right="0"/>
+        <w:ind w:hanging="0" w:start="0" w:end="0"/>
         <w:rPr>
           <w:rFonts w:ascii="Times New Roman" w:hAnsi="Times New Roman" w:cs="Times New Roman"/>
           <w:sz w:val="26"/>
@@ -855,7 +853,7 @@
           <w:tab w:val="right" w:pos="9356" w:leader="dot"/>
         </w:tabs>
         <w:spacing w:lineRule="auto" w:line="336"/>
-        <w:ind w:left="360" w:right="0"/>
+        <w:ind w:start="360" w:end="0"/>
         <w:rPr>
           <w:rFonts w:ascii="Times New Roman" w:hAnsi="Times New Roman" w:cs="Times New Roman"/>
           <w:sz w:val="26"/>
@@ -884,7 +882,7 @@
           <w:tab w:val="right" w:pos="9356" w:leader="dot"/>
         </w:tabs>
         <w:spacing w:lineRule="auto" w:line="336"/>
-        <w:ind w:hanging="0" w:left="0" w:right="0"/>
+        <w:ind w:hanging="0" w:start="0" w:end="0"/>
         <w:rPr>
           <w:rFonts w:ascii="Times New Roman" w:hAnsi="Times New Roman" w:cs="Times New Roman"/>
           <w:sz w:val="26"/>
@@ -909,7 +907,7 @@
           <w:tab w:val="right" w:pos="9356" w:leader="dot"/>
         </w:tabs>
         <w:spacing w:lineRule="auto" w:line="336"/>
-        <w:ind w:left="360" w:right="0"/>
+        <w:ind w:start="360" w:end="0"/>
         <w:rPr>
           <w:rFonts w:ascii="Times New Roman" w:hAnsi="Times New Roman" w:cs="Times New Roman"/>
           <w:sz w:val="26"/>
@@ -933,7 +931,7 @@
           <w:tab w:val="right" w:pos="9356" w:leader="dot"/>
         </w:tabs>
         <w:spacing w:lineRule="auto" w:line="336"/>
-        <w:ind w:left="360" w:right="0"/>
+        <w:ind w:start="360" w:end="0"/>
         <w:rPr>
           <w:rFonts w:ascii="Times New Roman" w:hAnsi="Times New Roman" w:cs="Times New Roman"/>
           <w:sz w:val="26"/>
@@ -952,14 +950,14 @@
     <w:tbl>
       <w:tblPr>
         <w:tblW w:w="9468" w:type="dxa"/>
-        <w:jc w:val="left"/>
+        <w:jc w:val="start"/>
         <w:tblInd w:w="0" w:type="dxa"/>
         <w:tblLayout w:type="fixed"/>
         <w:tblCellMar>
           <w:top w:w="0" w:type="dxa"/>
-          <w:left w:w="108" w:type="dxa"/>
+          <w:start w:w="108" w:type="dxa"/>
           <w:bottom w:w="0" w:type="dxa"/>
-          <w:right w:w="108" w:type="dxa"/>
+          <w:end w:w="108" w:type="dxa"/>
         </w:tblCellMar>
       </w:tblPr>
       <w:tblGrid>
@@ -1159,14 +1157,14 @@
     <w:tbl>
       <w:tblPr>
         <w:tblW w:w="9591" w:type="dxa"/>
-        <w:jc w:val="left"/>
+        <w:jc w:val="start"/>
         <w:tblInd w:w="0" w:type="dxa"/>
         <w:tblLayout w:type="fixed"/>
         <w:tblCellMar>
           <w:top w:w="0" w:type="dxa"/>
-          <w:left w:w="108" w:type="dxa"/>
+          <w:start w:w="108" w:type="dxa"/>
           <w:bottom w:w="0" w:type="dxa"/>
-          <w:right w:w="108" w:type="dxa"/>
+          <w:end w:w="108" w:type="dxa"/>
         </w:tblCellMar>
       </w:tblPr>
       <w:tblGrid>
@@ -1181,9 +1179,9 @@
             <w:tcW w:w="2397" w:type="dxa"/>
             <w:tcBorders>
               <w:top w:val="single" w:sz="4" w:space="0" w:color="000000"/>
-              <w:left w:val="single" w:sz="4" w:space="0" w:color="000000"/>
-              <w:bottom w:val="single" w:sz="4" w:space="0" w:color="000000"/>
-              <w:right w:val="single" w:sz="4" w:space="0" w:color="000000"/>
+              <w:start w:val="single" w:sz="4" w:space="0" w:color="000000"/>
+              <w:bottom w:val="single" w:sz="4" w:space="0" w:color="000000"/>
+              <w:end w:val="single" w:sz="4" w:space="0" w:color="000000"/>
             </w:tcBorders>
           </w:tcPr>
           <w:p>
@@ -1213,9 +1211,9 @@
             <w:tcW w:w="3161" w:type="dxa"/>
             <w:tcBorders>
               <w:top w:val="single" w:sz="4" w:space="0" w:color="000000"/>
-              <w:left w:val="single" w:sz="4" w:space="0" w:color="000000"/>
-              <w:bottom w:val="single" w:sz="4" w:space="0" w:color="000000"/>
-              <w:right w:val="single" w:sz="4" w:space="0" w:color="000000"/>
+              <w:start w:val="single" w:sz="4" w:space="0" w:color="000000"/>
+              <w:bottom w:val="single" w:sz="4" w:space="0" w:color="000000"/>
+              <w:end w:val="single" w:sz="4" w:space="0" w:color="000000"/>
             </w:tcBorders>
           </w:tcPr>
           <w:p>
@@ -1240,9 +1238,9 @@
             <w:tcW w:w="4033" w:type="dxa"/>
             <w:tcBorders>
               <w:top w:val="single" w:sz="4" w:space="0" w:color="000000"/>
-              <w:left w:val="single" w:sz="4" w:space="0" w:color="000000"/>
-              <w:bottom w:val="single" w:sz="4" w:space="0" w:color="000000"/>
-              <w:right w:val="single" w:sz="4" w:space="0" w:color="000000"/>
+              <w:start w:val="single" w:sz="4" w:space="0" w:color="000000"/>
+              <w:bottom w:val="single" w:sz="4" w:space="0" w:color="000000"/>
+              <w:end w:val="single" w:sz="4" w:space="0" w:color="000000"/>
             </w:tcBorders>
           </w:tcPr>
           <w:p>
@@ -1270,9 +1268,9 @@
             <w:tcW w:w="2397" w:type="dxa"/>
             <w:tcBorders>
               <w:top w:val="single" w:sz="4" w:space="0" w:color="000000"/>
-              <w:left w:val="single" w:sz="4" w:space="0" w:color="000000"/>
-              <w:bottom w:val="single" w:sz="4" w:space="0" w:color="000000"/>
-              <w:right w:val="single" w:sz="4" w:space="0" w:color="000000"/>
+              <w:start w:val="single" w:sz="4" w:space="0" w:color="000000"/>
+              <w:bottom w:val="single" w:sz="4" w:space="0" w:color="000000"/>
+              <w:end w:val="single" w:sz="4" w:space="0" w:color="000000"/>
             </w:tcBorders>
           </w:tcPr>
           <w:p>
@@ -1302,9 +1300,9 @@
             <w:tcW w:w="3161" w:type="dxa"/>
             <w:tcBorders>
               <w:top w:val="single" w:sz="4" w:space="0" w:color="000000"/>
-              <w:left w:val="single" w:sz="4" w:space="0" w:color="000000"/>
-              <w:bottom w:val="single" w:sz="4" w:space="0" w:color="000000"/>
-              <w:right w:val="single" w:sz="4" w:space="0" w:color="000000"/>
+              <w:start w:val="single" w:sz="4" w:space="0" w:color="000000"/>
+              <w:bottom w:val="single" w:sz="4" w:space="0" w:color="000000"/>
+              <w:end w:val="single" w:sz="4" w:space="0" w:color="000000"/>
             </w:tcBorders>
           </w:tcPr>
           <w:p>
@@ -1334,9 +1332,9 @@
             <w:tcW w:w="4033" w:type="dxa"/>
             <w:tcBorders>
               <w:top w:val="single" w:sz="4" w:space="0" w:color="000000"/>
-              <w:left w:val="single" w:sz="4" w:space="0" w:color="000000"/>
-              <w:bottom w:val="single" w:sz="4" w:space="0" w:color="000000"/>
-              <w:right w:val="single" w:sz="4" w:space="0" w:color="000000"/>
+              <w:start w:val="single" w:sz="4" w:space="0" w:color="000000"/>
+              <w:bottom w:val="single" w:sz="4" w:space="0" w:color="000000"/>
+              <w:end w:val="single" w:sz="4" w:space="0" w:color="000000"/>
             </w:tcBorders>
           </w:tcPr>
           <w:p>
@@ -1369,9 +1367,9 @@
             <w:tcW w:w="2397" w:type="dxa"/>
             <w:tcBorders>
               <w:top w:val="single" w:sz="4" w:space="0" w:color="000000"/>
-              <w:left w:val="single" w:sz="4" w:space="0" w:color="000000"/>
-              <w:bottom w:val="single" w:sz="4" w:space="0" w:color="000000"/>
-              <w:right w:val="single" w:sz="4" w:space="0" w:color="000000"/>
+              <w:start w:val="single" w:sz="4" w:space="0" w:color="000000"/>
+              <w:bottom w:val="single" w:sz="4" w:space="0" w:color="000000"/>
+              <w:end w:val="single" w:sz="4" w:space="0" w:color="000000"/>
             </w:tcBorders>
           </w:tcPr>
           <w:p>
@@ -1401,9 +1399,9 @@
             <w:tcW w:w="3161" w:type="dxa"/>
             <w:tcBorders>
               <w:top w:val="single" w:sz="4" w:space="0" w:color="000000"/>
-              <w:left w:val="single" w:sz="4" w:space="0" w:color="000000"/>
-              <w:bottom w:val="single" w:sz="4" w:space="0" w:color="000000"/>
-              <w:right w:val="single" w:sz="4" w:space="0" w:color="000000"/>
+              <w:start w:val="single" w:sz="4" w:space="0" w:color="000000"/>
+              <w:bottom w:val="single" w:sz="4" w:space="0" w:color="000000"/>
+              <w:end w:val="single" w:sz="4" w:space="0" w:color="000000"/>
             </w:tcBorders>
           </w:tcPr>
           <w:p>
@@ -1433,9 +1431,9 @@
             <w:tcW w:w="4033" w:type="dxa"/>
             <w:tcBorders>
               <w:top w:val="single" w:sz="4" w:space="0" w:color="000000"/>
-              <w:left w:val="single" w:sz="4" w:space="0" w:color="000000"/>
-              <w:bottom w:val="single" w:sz="4" w:space="0" w:color="000000"/>
-              <w:right w:val="single" w:sz="4" w:space="0" w:color="000000"/>
+              <w:start w:val="single" w:sz="4" w:space="0" w:color="000000"/>
+              <w:bottom w:val="single" w:sz="4" w:space="0" w:color="000000"/>
+              <w:end w:val="single" w:sz="4" w:space="0" w:color="000000"/>
             </w:tcBorders>
           </w:tcPr>
           <w:p>
@@ -1468,9 +1466,9 @@
             <w:tcW w:w="2397" w:type="dxa"/>
             <w:tcBorders>
               <w:top w:val="single" w:sz="4" w:space="0" w:color="000000"/>
-              <w:left w:val="single" w:sz="4" w:space="0" w:color="000000"/>
-              <w:bottom w:val="single" w:sz="4" w:space="0" w:color="000000"/>
-              <w:right w:val="single" w:sz="4" w:space="0" w:color="000000"/>
+              <w:start w:val="single" w:sz="4" w:space="0" w:color="000000"/>
+              <w:bottom w:val="single" w:sz="4" w:space="0" w:color="000000"/>
+              <w:end w:val="single" w:sz="4" w:space="0" w:color="000000"/>
             </w:tcBorders>
           </w:tcPr>
           <w:p>
@@ -1500,9 +1498,9 @@
             <w:tcW w:w="3161" w:type="dxa"/>
             <w:tcBorders>
               <w:top w:val="single" w:sz="4" w:space="0" w:color="000000"/>
-              <w:left w:val="single" w:sz="4" w:space="0" w:color="000000"/>
-              <w:bottom w:val="single" w:sz="4" w:space="0" w:color="000000"/>
-              <w:right w:val="single" w:sz="4" w:space="0" w:color="000000"/>
+              <w:start w:val="single" w:sz="4" w:space="0" w:color="000000"/>
+              <w:bottom w:val="single" w:sz="4" w:space="0" w:color="000000"/>
+              <w:end w:val="single" w:sz="4" w:space="0" w:color="000000"/>
             </w:tcBorders>
           </w:tcPr>
           <w:p>
@@ -1532,9 +1530,9 @@
             <w:tcW w:w="4033" w:type="dxa"/>
             <w:tcBorders>
               <w:top w:val="single" w:sz="4" w:space="0" w:color="000000"/>
-              <w:left w:val="single" w:sz="4" w:space="0" w:color="000000"/>
-              <w:bottom w:val="single" w:sz="4" w:space="0" w:color="000000"/>
-              <w:right w:val="single" w:sz="4" w:space="0" w:color="000000"/>
+              <w:start w:val="single" w:sz="4" w:space="0" w:color="000000"/>
+              <w:bottom w:val="single" w:sz="4" w:space="0" w:color="000000"/>
+              <w:end w:val="single" w:sz="4" w:space="0" w:color="000000"/>
             </w:tcBorders>
           </w:tcPr>
           <w:p>
@@ -1567,9 +1565,9 @@
             <w:tcW w:w="2397" w:type="dxa"/>
             <w:tcBorders>
               <w:top w:val="single" w:sz="4" w:space="0" w:color="000000"/>
-              <w:left w:val="single" w:sz="4" w:space="0" w:color="000000"/>
-              <w:bottom w:val="single" w:sz="4" w:space="0" w:color="000000"/>
-              <w:right w:val="single" w:sz="4" w:space="0" w:color="000000"/>
+              <w:start w:val="single" w:sz="4" w:space="0" w:color="000000"/>
+              <w:bottom w:val="single" w:sz="4" w:space="0" w:color="000000"/>
+              <w:end w:val="single" w:sz="4" w:space="0" w:color="000000"/>
             </w:tcBorders>
           </w:tcPr>
           <w:p>
@@ -1599,9 +1597,9 @@
             <w:tcW w:w="3161" w:type="dxa"/>
             <w:tcBorders>
               <w:top w:val="single" w:sz="4" w:space="0" w:color="000000"/>
-              <w:left w:val="single" w:sz="4" w:space="0" w:color="000000"/>
-              <w:bottom w:val="single" w:sz="4" w:space="0" w:color="000000"/>
-              <w:right w:val="single" w:sz="4" w:space="0" w:color="000000"/>
+              <w:start w:val="single" w:sz="4" w:space="0" w:color="000000"/>
+              <w:bottom w:val="single" w:sz="4" w:space="0" w:color="000000"/>
+              <w:end w:val="single" w:sz="4" w:space="0" w:color="000000"/>
             </w:tcBorders>
           </w:tcPr>
           <w:p>
@@ -1631,9 +1629,9 @@
             <w:tcW w:w="4033" w:type="dxa"/>
             <w:tcBorders>
               <w:top w:val="single" w:sz="4" w:space="0" w:color="000000"/>
-              <w:left w:val="single" w:sz="4" w:space="0" w:color="000000"/>
-              <w:bottom w:val="single" w:sz="4" w:space="0" w:color="000000"/>
-              <w:right w:val="single" w:sz="4" w:space="0" w:color="000000"/>
+              <w:start w:val="single" w:sz="4" w:space="0" w:color="000000"/>
+              <w:bottom w:val="single" w:sz="4" w:space="0" w:color="000000"/>
+              <w:end w:val="single" w:sz="4" w:space="0" w:color="000000"/>
             </w:tcBorders>
           </w:tcPr>
           <w:p>
@@ -1666,9 +1664,9 @@
             <w:tcW w:w="2397" w:type="dxa"/>
             <w:tcBorders>
               <w:top w:val="single" w:sz="4" w:space="0" w:color="000000"/>
-              <w:left w:val="single" w:sz="4" w:space="0" w:color="000000"/>
-              <w:bottom w:val="single" w:sz="4" w:space="0" w:color="000000"/>
-              <w:right w:val="single" w:sz="4" w:space="0" w:color="000000"/>
+              <w:start w:val="single" w:sz="4" w:space="0" w:color="000000"/>
+              <w:bottom w:val="single" w:sz="4" w:space="0" w:color="000000"/>
+              <w:end w:val="single" w:sz="4" w:space="0" w:color="000000"/>
             </w:tcBorders>
           </w:tcPr>
           <w:p>
@@ -1698,9 +1696,9 @@
             <w:tcW w:w="3161" w:type="dxa"/>
             <w:tcBorders>
               <w:top w:val="single" w:sz="4" w:space="0" w:color="000000"/>
-              <w:left w:val="single" w:sz="4" w:space="0" w:color="000000"/>
-              <w:bottom w:val="single" w:sz="4" w:space="0" w:color="000000"/>
-              <w:right w:val="single" w:sz="4" w:space="0" w:color="000000"/>
+              <w:start w:val="single" w:sz="4" w:space="0" w:color="000000"/>
+              <w:bottom w:val="single" w:sz="4" w:space="0" w:color="000000"/>
+              <w:end w:val="single" w:sz="4" w:space="0" w:color="000000"/>
             </w:tcBorders>
           </w:tcPr>
           <w:p>
@@ -1730,9 +1728,9 @@
             <w:tcW w:w="4033" w:type="dxa"/>
             <w:tcBorders>
               <w:top w:val="single" w:sz="4" w:space="0" w:color="000000"/>
-              <w:left w:val="single" w:sz="4" w:space="0" w:color="000000"/>
-              <w:bottom w:val="single" w:sz="4" w:space="0" w:color="000000"/>
-              <w:right w:val="single" w:sz="4" w:space="0" w:color="000000"/>
+              <w:start w:val="single" w:sz="4" w:space="0" w:color="000000"/>
+              <w:bottom w:val="single" w:sz="4" w:space="0" w:color="000000"/>
+              <w:end w:val="single" w:sz="4" w:space="0" w:color="000000"/>
             </w:tcBorders>
           </w:tcPr>
           <w:p>
@@ -1823,14 +1821,14 @@
     <w:tbl>
       <w:tblPr>
         <w:tblW w:w="9588" w:type="dxa"/>
-        <w:jc w:val="left"/>
+        <w:jc w:val="start"/>
         <w:tblInd w:w="0" w:type="dxa"/>
         <w:tblLayout w:type="fixed"/>
         <w:tblCellMar>
           <w:top w:w="0" w:type="dxa"/>
-          <w:left w:w="108" w:type="dxa"/>
+          <w:start w:w="108" w:type="dxa"/>
           <w:bottom w:w="0" w:type="dxa"/>
-          <w:right w:w="108" w:type="dxa"/>
+          <w:end w:w="108" w:type="dxa"/>
         </w:tblCellMar>
       </w:tblPr>
       <w:tblGrid>
@@ -1847,9 +1845,9 @@
             <w:tcW w:w="675" w:type="dxa"/>
             <w:tcBorders>
               <w:top w:val="single" w:sz="4" w:space="0" w:color="000000"/>
-              <w:left w:val="single" w:sz="4" w:space="0" w:color="000000"/>
-              <w:bottom w:val="single" w:sz="4" w:space="0" w:color="000000"/>
-              <w:right w:val="single" w:sz="4" w:space="0" w:color="000000"/>
+              <w:start w:val="single" w:sz="4" w:space="0" w:color="000000"/>
+              <w:bottom w:val="single" w:sz="4" w:space="0" w:color="000000"/>
+              <w:end w:val="single" w:sz="4" w:space="0" w:color="000000"/>
             </w:tcBorders>
           </w:tcPr>
           <w:p>
@@ -1879,9 +1877,9 @@
             <w:tcW w:w="3271" w:type="dxa"/>
             <w:tcBorders>
               <w:top w:val="single" w:sz="4" w:space="0" w:color="000000"/>
-              <w:left w:val="single" w:sz="4" w:space="0" w:color="000000"/>
-              <w:bottom w:val="single" w:sz="4" w:space="0" w:color="000000"/>
-              <w:right w:val="single" w:sz="4" w:space="0" w:color="000000"/>
+              <w:start w:val="single" w:sz="4" w:space="0" w:color="000000"/>
+              <w:bottom w:val="single" w:sz="4" w:space="0" w:color="000000"/>
+              <w:end w:val="single" w:sz="4" w:space="0" w:color="000000"/>
             </w:tcBorders>
           </w:tcPr>
           <w:p>
@@ -1911,9 +1909,9 @@
             <w:tcW w:w="1265" w:type="dxa"/>
             <w:tcBorders>
               <w:top w:val="single" w:sz="4" w:space="0" w:color="000000"/>
-              <w:left w:val="single" w:sz="4" w:space="0" w:color="000000"/>
-              <w:bottom w:val="single" w:sz="4" w:space="0" w:color="000000"/>
-              <w:right w:val="single" w:sz="4" w:space="0" w:color="000000"/>
+              <w:start w:val="single" w:sz="4" w:space="0" w:color="000000"/>
+              <w:bottom w:val="single" w:sz="4" w:space="0" w:color="000000"/>
+              <w:end w:val="single" w:sz="4" w:space="0" w:color="000000"/>
             </w:tcBorders>
           </w:tcPr>
           <w:p>
@@ -1938,9 +1936,9 @@
             <w:tcW w:w="1418" w:type="dxa"/>
             <w:tcBorders>
               <w:top w:val="single" w:sz="4" w:space="0" w:color="000000"/>
-              <w:left w:val="single" w:sz="4" w:space="0" w:color="000000"/>
-              <w:bottom w:val="single" w:sz="4" w:space="0" w:color="000000"/>
-              <w:right w:val="single" w:sz="4" w:space="0" w:color="000000"/>
+              <w:start w:val="single" w:sz="4" w:space="0" w:color="000000"/>
+              <w:bottom w:val="single" w:sz="4" w:space="0" w:color="000000"/>
+              <w:end w:val="single" w:sz="4" w:space="0" w:color="000000"/>
             </w:tcBorders>
           </w:tcPr>
           <w:p>
@@ -1970,9 +1968,9 @@
             <w:tcW w:w="2959" w:type="dxa"/>
             <w:tcBorders>
               <w:top w:val="single" w:sz="4" w:space="0" w:color="000000"/>
-              <w:left w:val="single" w:sz="4" w:space="0" w:color="000000"/>
-              <w:bottom w:val="single" w:sz="4" w:space="0" w:color="000000"/>
-              <w:right w:val="single" w:sz="4" w:space="0" w:color="000000"/>
+              <w:start w:val="single" w:sz="4" w:space="0" w:color="000000"/>
+              <w:bottom w:val="single" w:sz="4" w:space="0" w:color="000000"/>
+              <w:end w:val="single" w:sz="4" w:space="0" w:color="000000"/>
             </w:tcBorders>
           </w:tcPr>
           <w:p>
@@ -2005,9 +2003,9 @@
             <w:tcW w:w="675" w:type="dxa"/>
             <w:tcBorders>
               <w:top w:val="single" w:sz="4" w:space="0" w:color="000000"/>
-              <w:left w:val="single" w:sz="4" w:space="0" w:color="000000"/>
-              <w:bottom w:val="single" w:sz="4" w:space="0" w:color="000000"/>
-              <w:right w:val="single" w:sz="4" w:space="0" w:color="000000"/>
+              <w:start w:val="single" w:sz="4" w:space="0" w:color="000000"/>
+              <w:bottom w:val="single" w:sz="4" w:space="0" w:color="000000"/>
+              <w:end w:val="single" w:sz="4" w:space="0" w:color="000000"/>
             </w:tcBorders>
           </w:tcPr>
           <w:p>
@@ -2037,9 +2035,9 @@
             <w:tcW w:w="3271" w:type="dxa"/>
             <w:tcBorders>
               <w:top w:val="single" w:sz="4" w:space="0" w:color="000000"/>
-              <w:left w:val="single" w:sz="4" w:space="0" w:color="000000"/>
-              <w:bottom w:val="single" w:sz="4" w:space="0" w:color="000000"/>
-              <w:right w:val="single" w:sz="4" w:space="0" w:color="000000"/>
+              <w:start w:val="single" w:sz="4" w:space="0" w:color="000000"/>
+              <w:bottom w:val="single" w:sz="4" w:space="0" w:color="000000"/>
+              <w:end w:val="single" w:sz="4" w:space="0" w:color="000000"/>
             </w:tcBorders>
           </w:tcPr>
           <w:p>
@@ -2067,9 +2065,9 @@
             <w:tcW w:w="1265" w:type="dxa"/>
             <w:tcBorders>
               <w:top w:val="single" w:sz="4" w:space="0" w:color="000000"/>
-              <w:left w:val="single" w:sz="4" w:space="0" w:color="000000"/>
-              <w:bottom w:val="single" w:sz="4" w:space="0" w:color="000000"/>
-              <w:right w:val="single" w:sz="4" w:space="0" w:color="000000"/>
+              <w:start w:val="single" w:sz="4" w:space="0" w:color="000000"/>
+              <w:bottom w:val="single" w:sz="4" w:space="0" w:color="000000"/>
+              <w:end w:val="single" w:sz="4" w:space="0" w:color="000000"/>
             </w:tcBorders>
           </w:tcPr>
           <w:p>
@@ -2097,9 +2095,9 @@
             <w:tcW w:w="1418" w:type="dxa"/>
             <w:tcBorders>
               <w:top w:val="single" w:sz="4" w:space="0" w:color="000000"/>
-              <w:left w:val="single" w:sz="4" w:space="0" w:color="000000"/>
-              <w:bottom w:val="single" w:sz="4" w:space="0" w:color="000000"/>
-              <w:right w:val="single" w:sz="4" w:space="0" w:color="000000"/>
+              <w:start w:val="single" w:sz="4" w:space="0" w:color="000000"/>
+              <w:bottom w:val="single" w:sz="4" w:space="0" w:color="000000"/>
+              <w:end w:val="single" w:sz="4" w:space="0" w:color="000000"/>
             </w:tcBorders>
           </w:tcPr>
           <w:p>
@@ -2127,9 +2125,9 @@
             <w:tcW w:w="2959" w:type="dxa"/>
             <w:tcBorders>
               <w:top w:val="single" w:sz="4" w:space="0" w:color="000000"/>
-              <w:left w:val="single" w:sz="4" w:space="0" w:color="000000"/>
-              <w:bottom w:val="single" w:sz="4" w:space="0" w:color="000000"/>
-              <w:right w:val="single" w:sz="4" w:space="0" w:color="000000"/>
+              <w:start w:val="single" w:sz="4" w:space="0" w:color="000000"/>
+              <w:bottom w:val="single" w:sz="4" w:space="0" w:color="000000"/>
+              <w:end w:val="single" w:sz="4" w:space="0" w:color="000000"/>
             </w:tcBorders>
           </w:tcPr>
           <w:p>
@@ -2160,9 +2158,9 @@
             <w:tcW w:w="675" w:type="dxa"/>
             <w:tcBorders>
               <w:top w:val="single" w:sz="4" w:space="0" w:color="000000"/>
-              <w:left w:val="single" w:sz="4" w:space="0" w:color="000000"/>
-              <w:bottom w:val="single" w:sz="4" w:space="0" w:color="000000"/>
-              <w:right w:val="single" w:sz="4" w:space="0" w:color="000000"/>
+              <w:start w:val="single" w:sz="4" w:space="0" w:color="000000"/>
+              <w:bottom w:val="single" w:sz="4" w:space="0" w:color="000000"/>
+              <w:end w:val="single" w:sz="4" w:space="0" w:color="000000"/>
             </w:tcBorders>
           </w:tcPr>
           <w:p>
@@ -2190,9 +2188,9 @@
             <w:tcW w:w="3271" w:type="dxa"/>
             <w:tcBorders>
               <w:top w:val="single" w:sz="4" w:space="0" w:color="000000"/>
-              <w:left w:val="single" w:sz="4" w:space="0" w:color="000000"/>
-              <w:bottom w:val="single" w:sz="4" w:space="0" w:color="000000"/>
-              <w:right w:val="single" w:sz="4" w:space="0" w:color="000000"/>
+              <w:start w:val="single" w:sz="4" w:space="0" w:color="000000"/>
+              <w:bottom w:val="single" w:sz="4" w:space="0" w:color="000000"/>
+              <w:end w:val="single" w:sz="4" w:space="0" w:color="000000"/>
             </w:tcBorders>
           </w:tcPr>
           <w:p>
@@ -2220,9 +2218,9 @@
             <w:tcW w:w="1265" w:type="dxa"/>
             <w:tcBorders>
               <w:top w:val="single" w:sz="4" w:space="0" w:color="000000"/>
-              <w:left w:val="single" w:sz="4" w:space="0" w:color="000000"/>
-              <w:bottom w:val="single" w:sz="4" w:space="0" w:color="000000"/>
-              <w:right w:val="single" w:sz="4" w:space="0" w:color="000000"/>
+              <w:start w:val="single" w:sz="4" w:space="0" w:color="000000"/>
+              <w:bottom w:val="single" w:sz="4" w:space="0" w:color="000000"/>
+              <w:end w:val="single" w:sz="4" w:space="0" w:color="000000"/>
             </w:tcBorders>
           </w:tcPr>
           <w:p>
@@ -2250,9 +2248,9 @@
             <w:tcW w:w="1418" w:type="dxa"/>
             <w:tcBorders>
               <w:top w:val="single" w:sz="4" w:space="0" w:color="000000"/>
-              <w:left w:val="single" w:sz="4" w:space="0" w:color="000000"/>
-              <w:bottom w:val="single" w:sz="4" w:space="0" w:color="000000"/>
-              <w:right w:val="single" w:sz="4" w:space="0" w:color="000000"/>
+              <w:start w:val="single" w:sz="4" w:space="0" w:color="000000"/>
+              <w:bottom w:val="single" w:sz="4" w:space="0" w:color="000000"/>
+              <w:end w:val="single" w:sz="4" w:space="0" w:color="000000"/>
             </w:tcBorders>
           </w:tcPr>
           <w:p>
@@ -2280,9 +2278,9 @@
             <w:tcW w:w="2959" w:type="dxa"/>
             <w:tcBorders>
               <w:top w:val="single" w:sz="4" w:space="0" w:color="000000"/>
-              <w:left w:val="single" w:sz="4" w:space="0" w:color="000000"/>
-              <w:bottom w:val="single" w:sz="4" w:space="0" w:color="000000"/>
-              <w:right w:val="single" w:sz="4" w:space="0" w:color="000000"/>
+              <w:start w:val="single" w:sz="4" w:space="0" w:color="000000"/>
+              <w:bottom w:val="single" w:sz="4" w:space="0" w:color="000000"/>
+              <w:end w:val="single" w:sz="4" w:space="0" w:color="000000"/>
             </w:tcBorders>
           </w:tcPr>
           <w:p>
@@ -2313,9 +2311,9 @@
             <w:tcW w:w="675" w:type="dxa"/>
             <w:tcBorders>
               <w:top w:val="single" w:sz="4" w:space="0" w:color="000000"/>
-              <w:left w:val="single" w:sz="4" w:space="0" w:color="000000"/>
-              <w:bottom w:val="single" w:sz="4" w:space="0" w:color="000000"/>
-              <w:right w:val="single" w:sz="4" w:space="0" w:color="000000"/>
+              <w:start w:val="single" w:sz="4" w:space="0" w:color="000000"/>
+              <w:bottom w:val="single" w:sz="4" w:space="0" w:color="000000"/>
+              <w:end w:val="single" w:sz="4" w:space="0" w:color="000000"/>
             </w:tcBorders>
           </w:tcPr>
           <w:p>
@@ -2343,9 +2341,9 @@
             <w:tcW w:w="3271" w:type="dxa"/>
             <w:tcBorders>
               <w:top w:val="single" w:sz="4" w:space="0" w:color="000000"/>
-              <w:left w:val="single" w:sz="4" w:space="0" w:color="000000"/>
-              <w:bottom w:val="single" w:sz="4" w:space="0" w:color="000000"/>
-              <w:right w:val="single" w:sz="4" w:space="0" w:color="000000"/>
+              <w:start w:val="single" w:sz="4" w:space="0" w:color="000000"/>
+              <w:bottom w:val="single" w:sz="4" w:space="0" w:color="000000"/>
+              <w:end w:val="single" w:sz="4" w:space="0" w:color="000000"/>
             </w:tcBorders>
           </w:tcPr>
           <w:p>
@@ -2373,9 +2371,9 @@
             <w:tcW w:w="1265" w:type="dxa"/>
             <w:tcBorders>
               <w:top w:val="single" w:sz="4" w:space="0" w:color="000000"/>
-              <w:left w:val="single" w:sz="4" w:space="0" w:color="000000"/>
-              <w:bottom w:val="single" w:sz="4" w:space="0" w:color="000000"/>
-              <w:right w:val="single" w:sz="4" w:space="0" w:color="000000"/>
+              <w:start w:val="single" w:sz="4" w:space="0" w:color="000000"/>
+              <w:bottom w:val="single" w:sz="4" w:space="0" w:color="000000"/>
+              <w:end w:val="single" w:sz="4" w:space="0" w:color="000000"/>
             </w:tcBorders>
           </w:tcPr>
           <w:p>
@@ -2403,9 +2401,9 @@
             <w:tcW w:w="1418" w:type="dxa"/>
             <w:tcBorders>
               <w:top w:val="single" w:sz="4" w:space="0" w:color="000000"/>
-              <w:left w:val="single" w:sz="4" w:space="0" w:color="000000"/>
-              <w:bottom w:val="single" w:sz="4" w:space="0" w:color="000000"/>
-              <w:right w:val="single" w:sz="4" w:space="0" w:color="000000"/>
+              <w:start w:val="single" w:sz="4" w:space="0" w:color="000000"/>
+              <w:bottom w:val="single" w:sz="4" w:space="0" w:color="000000"/>
+              <w:end w:val="single" w:sz="4" w:space="0" w:color="000000"/>
             </w:tcBorders>
           </w:tcPr>
           <w:p>
@@ -2433,9 +2431,9 @@
             <w:tcW w:w="2959" w:type="dxa"/>
             <w:tcBorders>
               <w:top w:val="single" w:sz="4" w:space="0" w:color="000000"/>
-              <w:left w:val="single" w:sz="4" w:space="0" w:color="000000"/>
-              <w:bottom w:val="single" w:sz="4" w:space="0" w:color="000000"/>
-              <w:right w:val="single" w:sz="4" w:space="0" w:color="000000"/>
+              <w:start w:val="single" w:sz="4" w:space="0" w:color="000000"/>
+              <w:bottom w:val="single" w:sz="4" w:space="0" w:color="000000"/>
+              <w:end w:val="single" w:sz="4" w:space="0" w:color="000000"/>
             </w:tcBorders>
           </w:tcPr>
           <w:p>
@@ -2466,9 +2464,9 @@
             <w:tcW w:w="675" w:type="dxa"/>
             <w:tcBorders>
               <w:top w:val="single" w:sz="4" w:space="0" w:color="000000"/>
-              <w:left w:val="single" w:sz="4" w:space="0" w:color="000000"/>
-              <w:bottom w:val="single" w:sz="4" w:space="0" w:color="000000"/>
-              <w:right w:val="single" w:sz="4" w:space="0" w:color="000000"/>
+              <w:start w:val="single" w:sz="4" w:space="0" w:color="000000"/>
+              <w:bottom w:val="single" w:sz="4" w:space="0" w:color="000000"/>
+              <w:end w:val="single" w:sz="4" w:space="0" w:color="000000"/>
             </w:tcBorders>
           </w:tcPr>
           <w:p>
@@ -2496,9 +2494,9 @@
             <w:tcW w:w="3271" w:type="dxa"/>
             <w:tcBorders>
               <w:top w:val="single" w:sz="4" w:space="0" w:color="000000"/>
-              <w:left w:val="single" w:sz="4" w:space="0" w:color="000000"/>
-              <w:bottom w:val="single" w:sz="4" w:space="0" w:color="000000"/>
-              <w:right w:val="single" w:sz="4" w:space="0" w:color="000000"/>
+              <w:start w:val="single" w:sz="4" w:space="0" w:color="000000"/>
+              <w:bottom w:val="single" w:sz="4" w:space="0" w:color="000000"/>
+              <w:end w:val="single" w:sz="4" w:space="0" w:color="000000"/>
             </w:tcBorders>
           </w:tcPr>
           <w:p>
@@ -2526,9 +2524,9 @@
             <w:tcW w:w="1265" w:type="dxa"/>
             <w:tcBorders>
               <w:top w:val="single" w:sz="4" w:space="0" w:color="000000"/>
-              <w:left w:val="single" w:sz="4" w:space="0" w:color="000000"/>
-              <w:bottom w:val="single" w:sz="4" w:space="0" w:color="000000"/>
-              <w:right w:val="single" w:sz="4" w:space="0" w:color="000000"/>
+              <w:start w:val="single" w:sz="4" w:space="0" w:color="000000"/>
+              <w:bottom w:val="single" w:sz="4" w:space="0" w:color="000000"/>
+              <w:end w:val="single" w:sz="4" w:space="0" w:color="000000"/>
             </w:tcBorders>
           </w:tcPr>
           <w:p>
@@ -2556,9 +2554,9 @@
             <w:tcW w:w="1418" w:type="dxa"/>
             <w:tcBorders>
               <w:top w:val="single" w:sz="4" w:space="0" w:color="000000"/>
-              <w:left w:val="single" w:sz="4" w:space="0" w:color="000000"/>
-              <w:bottom w:val="single" w:sz="4" w:space="0" w:color="000000"/>
-              <w:right w:val="single" w:sz="4" w:space="0" w:color="000000"/>
+              <w:start w:val="single" w:sz="4" w:space="0" w:color="000000"/>
+              <w:bottom w:val="single" w:sz="4" w:space="0" w:color="000000"/>
+              <w:end w:val="single" w:sz="4" w:space="0" w:color="000000"/>
             </w:tcBorders>
           </w:tcPr>
           <w:p>
@@ -2586,9 +2584,9 @@
             <w:tcW w:w="2959" w:type="dxa"/>
             <w:tcBorders>
               <w:top w:val="single" w:sz="4" w:space="0" w:color="000000"/>
-              <w:left w:val="single" w:sz="4" w:space="0" w:color="000000"/>
-              <w:bottom w:val="single" w:sz="4" w:space="0" w:color="000000"/>
-              <w:right w:val="single" w:sz="4" w:space="0" w:color="000000"/>
+              <w:start w:val="single" w:sz="4" w:space="0" w:color="000000"/>
+              <w:bottom w:val="single" w:sz="4" w:space="0" w:color="000000"/>
+              <w:end w:val="single" w:sz="4" w:space="0" w:color="000000"/>
             </w:tcBorders>
           </w:tcPr>
           <w:p>
@@ -2619,9 +2617,9 @@
             <w:tcW w:w="675" w:type="dxa"/>
             <w:tcBorders>
               <w:top w:val="single" w:sz="4" w:space="0" w:color="000000"/>
-              <w:left w:val="single" w:sz="4" w:space="0" w:color="000000"/>
-              <w:bottom w:val="single" w:sz="4" w:space="0" w:color="000000"/>
-              <w:right w:val="single" w:sz="4" w:space="0" w:color="000000"/>
+              <w:start w:val="single" w:sz="4" w:space="0" w:color="000000"/>
+              <w:bottom w:val="single" w:sz="4" w:space="0" w:color="000000"/>
+              <w:end w:val="single" w:sz="4" w:space="0" w:color="000000"/>
             </w:tcBorders>
           </w:tcPr>
           <w:p>
@@ -2649,9 +2647,9 @@
             <w:tcW w:w="3271" w:type="dxa"/>
             <w:tcBorders>
               <w:top w:val="single" w:sz="4" w:space="0" w:color="000000"/>
-              <w:left w:val="single" w:sz="4" w:space="0" w:color="000000"/>
-              <w:bottom w:val="single" w:sz="4" w:space="0" w:color="000000"/>
-              <w:right w:val="single" w:sz="4" w:space="0" w:color="000000"/>
+              <w:start w:val="single" w:sz="4" w:space="0" w:color="000000"/>
+              <w:bottom w:val="single" w:sz="4" w:space="0" w:color="000000"/>
+              <w:end w:val="single" w:sz="4" w:space="0" w:color="000000"/>
             </w:tcBorders>
           </w:tcPr>
           <w:p>
@@ -2679,9 +2677,9 @@
             <w:tcW w:w="1265" w:type="dxa"/>
             <w:tcBorders>
               <w:top w:val="single" w:sz="4" w:space="0" w:color="000000"/>
-              <w:left w:val="single" w:sz="4" w:space="0" w:color="000000"/>
-              <w:bottom w:val="single" w:sz="4" w:space="0" w:color="000000"/>
-              <w:right w:val="single" w:sz="4" w:space="0" w:color="000000"/>
+              <w:start w:val="single" w:sz="4" w:space="0" w:color="000000"/>
+              <w:bottom w:val="single" w:sz="4" w:space="0" w:color="000000"/>
+              <w:end w:val="single" w:sz="4" w:space="0" w:color="000000"/>
             </w:tcBorders>
           </w:tcPr>
           <w:p>
@@ -2709,9 +2707,9 @@
             <w:tcW w:w="1418" w:type="dxa"/>
             <w:tcBorders>
               <w:top w:val="single" w:sz="4" w:space="0" w:color="000000"/>
-              <w:left w:val="single" w:sz="4" w:space="0" w:color="000000"/>
-              <w:bottom w:val="single" w:sz="4" w:space="0" w:color="000000"/>
-              <w:right w:val="single" w:sz="4" w:space="0" w:color="000000"/>
+              <w:start w:val="single" w:sz="4" w:space="0" w:color="000000"/>
+              <w:bottom w:val="single" w:sz="4" w:space="0" w:color="000000"/>
+              <w:end w:val="single" w:sz="4" w:space="0" w:color="000000"/>
             </w:tcBorders>
           </w:tcPr>
           <w:p>
@@ -2739,9 +2737,9 @@
             <w:tcW w:w="2959" w:type="dxa"/>
             <w:tcBorders>
               <w:top w:val="single" w:sz="4" w:space="0" w:color="000000"/>
-              <w:left w:val="single" w:sz="4" w:space="0" w:color="000000"/>
-              <w:bottom w:val="single" w:sz="4" w:space="0" w:color="000000"/>
-              <w:right w:val="single" w:sz="4" w:space="0" w:color="000000"/>
+              <w:start w:val="single" w:sz="4" w:space="0" w:color="000000"/>
+              <w:bottom w:val="single" w:sz="4" w:space="0" w:color="000000"/>
+              <w:end w:val="single" w:sz="4" w:space="0" w:color="000000"/>
             </w:tcBorders>
           </w:tcPr>
           <w:p>
@@ -2806,14 +2804,14 @@
     <w:tbl>
       <w:tblPr>
         <w:tblW w:w="9571" w:type="dxa"/>
-        <w:jc w:val="left"/>
+        <w:jc w:val="start"/>
         <w:tblInd w:w="0" w:type="dxa"/>
         <w:tblLayout w:type="fixed"/>
         <w:tblCellMar>
           <w:top w:w="0" w:type="dxa"/>
-          <w:left w:w="108" w:type="dxa"/>
+          <w:start w:w="108" w:type="dxa"/>
           <w:bottom w:w="0" w:type="dxa"/>
-          <w:right w:w="108" w:type="dxa"/>
+          <w:end w:w="108" w:type="dxa"/>
         </w:tblCellMar>
       </w:tblPr>
       <w:tblGrid>
@@ -2829,9 +2827,9 @@
             <w:tcW w:w="708" w:type="dxa"/>
             <w:tcBorders>
               <w:top w:val="single" w:sz="4" w:space="0" w:color="000000"/>
-              <w:left w:val="single" w:sz="4" w:space="0" w:color="000000"/>
-              <w:bottom w:val="single" w:sz="4" w:space="0" w:color="000000"/>
-              <w:right w:val="single" w:sz="4" w:space="0" w:color="000000"/>
+              <w:start w:val="single" w:sz="4" w:space="0" w:color="000000"/>
+              <w:bottom w:val="single" w:sz="4" w:space="0" w:color="000000"/>
+              <w:end w:val="single" w:sz="4" w:space="0" w:color="000000"/>
             </w:tcBorders>
           </w:tcPr>
           <w:p>
@@ -2862,9 +2860,9 @@
             <w:tcW w:w="3240" w:type="dxa"/>
             <w:tcBorders>
               <w:top w:val="single" w:sz="4" w:space="0" w:color="000000"/>
-              <w:left w:val="single" w:sz="4" w:space="0" w:color="000000"/>
-              <w:bottom w:val="single" w:sz="4" w:space="0" w:color="000000"/>
-              <w:right w:val="single" w:sz="4" w:space="0" w:color="000000"/>
+              <w:start w:val="single" w:sz="4" w:space="0" w:color="000000"/>
+              <w:bottom w:val="single" w:sz="4" w:space="0" w:color="000000"/>
+              <w:end w:val="single" w:sz="4" w:space="0" w:color="000000"/>
             </w:tcBorders>
           </w:tcPr>
           <w:p>
@@ -2895,9 +2893,9 @@
             <w:tcW w:w="1242" w:type="dxa"/>
             <w:tcBorders>
               <w:top w:val="single" w:sz="4" w:space="0" w:color="000000"/>
-              <w:left w:val="single" w:sz="4" w:space="0" w:color="000000"/>
-              <w:bottom w:val="single" w:sz="4" w:space="0" w:color="000000"/>
-              <w:right w:val="single" w:sz="4" w:space="0" w:color="000000"/>
+              <w:start w:val="single" w:sz="4" w:space="0" w:color="000000"/>
+              <w:bottom w:val="single" w:sz="4" w:space="0" w:color="000000"/>
+              <w:end w:val="single" w:sz="4" w:space="0" w:color="000000"/>
             </w:tcBorders>
           </w:tcPr>
           <w:p>
@@ -2928,9 +2926,9 @@
             <w:tcW w:w="4381" w:type="dxa"/>
             <w:tcBorders>
               <w:top w:val="single" w:sz="4" w:space="0" w:color="000000"/>
-              <w:left w:val="single" w:sz="4" w:space="0" w:color="000000"/>
-              <w:bottom w:val="single" w:sz="4" w:space="0" w:color="000000"/>
-              <w:right w:val="single" w:sz="4" w:space="0" w:color="000000"/>
+              <w:start w:val="single" w:sz="4" w:space="0" w:color="000000"/>
+              <w:bottom w:val="single" w:sz="4" w:space="0" w:color="000000"/>
+              <w:end w:val="single" w:sz="4" w:space="0" w:color="000000"/>
             </w:tcBorders>
           </w:tcPr>
           <w:p>
@@ -2964,9 +2962,9 @@
             <w:tcW w:w="708" w:type="dxa"/>
             <w:tcBorders>
               <w:top w:val="single" w:sz="4" w:space="0" w:color="000000"/>
-              <w:left w:val="single" w:sz="4" w:space="0" w:color="000000"/>
-              <w:bottom w:val="single" w:sz="4" w:space="0" w:color="000000"/>
-              <w:right w:val="single" w:sz="4" w:space="0" w:color="000000"/>
+              <w:start w:val="single" w:sz="4" w:space="0" w:color="000000"/>
+              <w:bottom w:val="single" w:sz="4" w:space="0" w:color="000000"/>
+              <w:end w:val="single" w:sz="4" w:space="0" w:color="000000"/>
             </w:tcBorders>
           </w:tcPr>
           <w:p>
@@ -2996,9 +2994,9 @@
             <w:tcW w:w="3240" w:type="dxa"/>
             <w:tcBorders>
               <w:top w:val="single" w:sz="4" w:space="0" w:color="000000"/>
-              <w:left w:val="single" w:sz="4" w:space="0" w:color="000000"/>
-              <w:bottom w:val="single" w:sz="4" w:space="0" w:color="000000"/>
-              <w:right w:val="single" w:sz="4" w:space="0" w:color="000000"/>
+              <w:start w:val="single" w:sz="4" w:space="0" w:color="000000"/>
+              <w:bottom w:val="single" w:sz="4" w:space="0" w:color="000000"/>
+              <w:end w:val="single" w:sz="4" w:space="0" w:color="000000"/>
             </w:tcBorders>
           </w:tcPr>
           <w:p>
@@ -3026,9 +3024,9 @@
             <w:tcW w:w="1242" w:type="dxa"/>
             <w:tcBorders>
               <w:top w:val="single" w:sz="4" w:space="0" w:color="000000"/>
-              <w:left w:val="single" w:sz="4" w:space="0" w:color="000000"/>
-              <w:bottom w:val="single" w:sz="4" w:space="0" w:color="000000"/>
-              <w:right w:val="single" w:sz="4" w:space="0" w:color="000000"/>
+              <w:start w:val="single" w:sz="4" w:space="0" w:color="000000"/>
+              <w:bottom w:val="single" w:sz="4" w:space="0" w:color="000000"/>
+              <w:end w:val="single" w:sz="4" w:space="0" w:color="000000"/>
             </w:tcBorders>
           </w:tcPr>
           <w:p>
@@ -3056,9 +3054,9 @@
             <w:tcW w:w="4381" w:type="dxa"/>
             <w:tcBorders>
               <w:top w:val="single" w:sz="4" w:space="0" w:color="000000"/>
-              <w:left w:val="single" w:sz="4" w:space="0" w:color="000000"/>
-              <w:bottom w:val="single" w:sz="4" w:space="0" w:color="000000"/>
-              <w:right w:val="single" w:sz="4" w:space="0" w:color="000000"/>
+              <w:start w:val="single" w:sz="4" w:space="0" w:color="000000"/>
+              <w:bottom w:val="single" w:sz="4" w:space="0" w:color="000000"/>
+              <w:end w:val="single" w:sz="4" w:space="0" w:color="000000"/>
             </w:tcBorders>
           </w:tcPr>
           <w:p>
@@ -3089,9 +3087,9 @@
             <w:tcW w:w="708" w:type="dxa"/>
             <w:tcBorders>
               <w:top w:val="single" w:sz="4" w:space="0" w:color="000000"/>
-              <w:left w:val="single" w:sz="4" w:space="0" w:color="000000"/>
-              <w:bottom w:val="single" w:sz="4" w:space="0" w:color="000000"/>
-              <w:right w:val="single" w:sz="4" w:space="0" w:color="000000"/>
+              <w:start w:val="single" w:sz="4" w:space="0" w:color="000000"/>
+              <w:bottom w:val="single" w:sz="4" w:space="0" w:color="000000"/>
+              <w:end w:val="single" w:sz="4" w:space="0" w:color="000000"/>
             </w:tcBorders>
           </w:tcPr>
           <w:p>
@@ -3119,9 +3117,9 @@
             <w:tcW w:w="3240" w:type="dxa"/>
             <w:tcBorders>
               <w:top w:val="single" w:sz="4" w:space="0" w:color="000000"/>
-              <w:left w:val="single" w:sz="4" w:space="0" w:color="000000"/>
-              <w:bottom w:val="single" w:sz="4" w:space="0" w:color="000000"/>
-              <w:right w:val="single" w:sz="4" w:space="0" w:color="000000"/>
+              <w:start w:val="single" w:sz="4" w:space="0" w:color="000000"/>
+              <w:bottom w:val="single" w:sz="4" w:space="0" w:color="000000"/>
+              <w:end w:val="single" w:sz="4" w:space="0" w:color="000000"/>
             </w:tcBorders>
           </w:tcPr>
           <w:p>
@@ -3149,9 +3147,9 @@
             <w:tcW w:w="1242" w:type="dxa"/>
             <w:tcBorders>
               <w:top w:val="single" w:sz="4" w:space="0" w:color="000000"/>
-              <w:left w:val="single" w:sz="4" w:space="0" w:color="000000"/>
-              <w:bottom w:val="single" w:sz="4" w:space="0" w:color="000000"/>
-              <w:right w:val="single" w:sz="4" w:space="0" w:color="000000"/>
+              <w:start w:val="single" w:sz="4" w:space="0" w:color="000000"/>
+              <w:bottom w:val="single" w:sz="4" w:space="0" w:color="000000"/>
+              <w:end w:val="single" w:sz="4" w:space="0" w:color="000000"/>
             </w:tcBorders>
           </w:tcPr>
           <w:p>
@@ -3179,9 +3177,9 @@
             <w:tcW w:w="4381" w:type="dxa"/>
             <w:tcBorders>
               <w:top w:val="single" w:sz="4" w:space="0" w:color="000000"/>
-              <w:left w:val="single" w:sz="4" w:space="0" w:color="000000"/>
-              <w:bottom w:val="single" w:sz="4" w:space="0" w:color="000000"/>
-              <w:right w:val="single" w:sz="4" w:space="0" w:color="000000"/>
+              <w:start w:val="single" w:sz="4" w:space="0" w:color="000000"/>
+              <w:bottom w:val="single" w:sz="4" w:space="0" w:color="000000"/>
+              <w:end w:val="single" w:sz="4" w:space="0" w:color="000000"/>
             </w:tcBorders>
           </w:tcPr>
           <w:p>
@@ -3212,9 +3210,9 @@
             <w:tcW w:w="708" w:type="dxa"/>
             <w:tcBorders>
               <w:top w:val="single" w:sz="4" w:space="0" w:color="000000"/>
-              <w:left w:val="single" w:sz="4" w:space="0" w:color="000000"/>
-              <w:bottom w:val="single" w:sz="4" w:space="0" w:color="000000"/>
-              <w:right w:val="single" w:sz="4" w:space="0" w:color="000000"/>
+              <w:start w:val="single" w:sz="4" w:space="0" w:color="000000"/>
+              <w:bottom w:val="single" w:sz="4" w:space="0" w:color="000000"/>
+              <w:end w:val="single" w:sz="4" w:space="0" w:color="000000"/>
             </w:tcBorders>
           </w:tcPr>
           <w:p>
@@ -3242,9 +3240,9 @@
             <w:tcW w:w="3240" w:type="dxa"/>
             <w:tcBorders>
               <w:top w:val="single" w:sz="4" w:space="0" w:color="000000"/>
-              <w:left w:val="single" w:sz="4" w:space="0" w:color="000000"/>
-              <w:bottom w:val="single" w:sz="4" w:space="0" w:color="000000"/>
-              <w:right w:val="single" w:sz="4" w:space="0" w:color="000000"/>
+              <w:start w:val="single" w:sz="4" w:space="0" w:color="000000"/>
+              <w:bottom w:val="single" w:sz="4" w:space="0" w:color="000000"/>
+              <w:end w:val="single" w:sz="4" w:space="0" w:color="000000"/>
             </w:tcBorders>
           </w:tcPr>
           <w:p>
@@ -3272,9 +3270,9 @@
             <w:tcW w:w="1242" w:type="dxa"/>
             <w:tcBorders>
               <w:top w:val="single" w:sz="4" w:space="0" w:color="000000"/>
-              <w:left w:val="single" w:sz="4" w:space="0" w:color="000000"/>
-              <w:bottom w:val="single" w:sz="4" w:space="0" w:color="000000"/>
-              <w:right w:val="single" w:sz="4" w:space="0" w:color="000000"/>
+              <w:start w:val="single" w:sz="4" w:space="0" w:color="000000"/>
+              <w:bottom w:val="single" w:sz="4" w:space="0" w:color="000000"/>
+              <w:end w:val="single" w:sz="4" w:space="0" w:color="000000"/>
             </w:tcBorders>
           </w:tcPr>
           <w:p>
@@ -3302,9 +3300,9 @@
             <w:tcW w:w="4381" w:type="dxa"/>
             <w:tcBorders>
               <w:top w:val="single" w:sz="4" w:space="0" w:color="000000"/>
-              <w:left w:val="single" w:sz="4" w:space="0" w:color="000000"/>
-              <w:bottom w:val="single" w:sz="4" w:space="0" w:color="000000"/>
-              <w:right w:val="single" w:sz="4" w:space="0" w:color="000000"/>
+              <w:start w:val="single" w:sz="4" w:space="0" w:color="000000"/>
+              <w:bottom w:val="single" w:sz="4" w:space="0" w:color="000000"/>
+              <w:end w:val="single" w:sz="4" w:space="0" w:color="000000"/>
             </w:tcBorders>
           </w:tcPr>
           <w:p>
@@ -3335,9 +3333,9 @@
             <w:tcW w:w="708" w:type="dxa"/>
             <w:tcBorders>
               <w:top w:val="single" w:sz="4" w:space="0" w:color="000000"/>
-              <w:left w:val="single" w:sz="4" w:space="0" w:color="000000"/>
-              <w:bottom w:val="single" w:sz="4" w:space="0" w:color="000000"/>
-              <w:right w:val="single" w:sz="4" w:space="0" w:color="000000"/>
+              <w:start w:val="single" w:sz="4" w:space="0" w:color="000000"/>
+              <w:bottom w:val="single" w:sz="4" w:space="0" w:color="000000"/>
+              <w:end w:val="single" w:sz="4" w:space="0" w:color="000000"/>
             </w:tcBorders>
           </w:tcPr>
           <w:p>
@@ -3365,9 +3363,9 @@
             <w:tcW w:w="3240" w:type="dxa"/>
             <w:tcBorders>
               <w:top w:val="single" w:sz="4" w:space="0" w:color="000000"/>
-              <w:left w:val="single" w:sz="4" w:space="0" w:color="000000"/>
-              <w:bottom w:val="single" w:sz="4" w:space="0" w:color="000000"/>
-              <w:right w:val="single" w:sz="4" w:space="0" w:color="000000"/>
+              <w:start w:val="single" w:sz="4" w:space="0" w:color="000000"/>
+              <w:bottom w:val="single" w:sz="4" w:space="0" w:color="000000"/>
+              <w:end w:val="single" w:sz="4" w:space="0" w:color="000000"/>
             </w:tcBorders>
           </w:tcPr>
           <w:p>
@@ -3395,9 +3393,9 @@
             <w:tcW w:w="1242" w:type="dxa"/>
             <w:tcBorders>
               <w:top w:val="single" w:sz="4" w:space="0" w:color="000000"/>
-              <w:left w:val="single" w:sz="4" w:space="0" w:color="000000"/>
-              <w:bottom w:val="single" w:sz="4" w:space="0" w:color="000000"/>
-              <w:right w:val="single" w:sz="4" w:space="0" w:color="000000"/>
+              <w:start w:val="single" w:sz="4" w:space="0" w:color="000000"/>
+              <w:bottom w:val="single" w:sz="4" w:space="0" w:color="000000"/>
+              <w:end w:val="single" w:sz="4" w:space="0" w:color="000000"/>
             </w:tcBorders>
           </w:tcPr>
           <w:p>
@@ -3425,9 +3423,9 @@
             <w:tcW w:w="4381" w:type="dxa"/>
             <w:tcBorders>
               <w:top w:val="single" w:sz="4" w:space="0" w:color="000000"/>
-              <w:left w:val="single" w:sz="4" w:space="0" w:color="000000"/>
-              <w:bottom w:val="single" w:sz="4" w:space="0" w:color="000000"/>
-              <w:right w:val="single" w:sz="4" w:space="0" w:color="000000"/>
+              <w:start w:val="single" w:sz="4" w:space="0" w:color="000000"/>
+              <w:bottom w:val="single" w:sz="4" w:space="0" w:color="000000"/>
+              <w:end w:val="single" w:sz="4" w:space="0" w:color="000000"/>
             </w:tcBorders>
           </w:tcPr>
           <w:p>
@@ -3484,13 +3482,12 @@
         </w:numPr>
         <w:autoSpaceDE w:val="false"/>
         <w:spacing w:lineRule="auto" w:line="360"/>
-        <w:ind w:firstLine="720" w:left="2880" w:right="0"/>
+        <w:ind w:firstLine="720" w:start="2880" w:end="0"/>
         <w:jc w:val="center"/>
         <w:outlineLvl w:val="1"/>
         <w:rPr>
           <w:rFonts w:ascii="Times New Roman" w:hAnsi="Times New Roman" w:cs="Times New Roman"/>
           <w:bCs/>
-          <w:i/>
           <w:i/>
           <w:sz w:val="26"/>
           <w:szCs w:val="26"/>
@@ -3523,14 +3520,14 @@
     <w:tbl>
       <w:tblPr>
         <w:tblW w:w="9468" w:type="dxa"/>
-        <w:jc w:val="left"/>
+        <w:jc w:val="start"/>
         <w:tblInd w:w="0" w:type="dxa"/>
         <w:tblLayout w:type="fixed"/>
         <w:tblCellMar>
           <w:top w:w="0" w:type="dxa"/>
-          <w:left w:w="108" w:type="dxa"/>
+          <w:start w:w="108" w:type="dxa"/>
           <w:bottom w:w="0" w:type="dxa"/>
-          <w:right w:w="108" w:type="dxa"/>
+          <w:end w:w="108" w:type="dxa"/>
         </w:tblCellMar>
       </w:tblPr>
       <w:tblGrid>
@@ -3640,7 +3637,7 @@
   <w:p>
     <w:pPr>
       <w:pStyle w:val="Footer"/>
-      <w:jc w:val="right"/>
+      <w:jc w:val="end"/>
       <w:rPr/>
     </w:pPr>
     <w:r>
@@ -3655,36 +3652,36 @@
     <w:r>
       <w:rPr>
         <w:rStyle w:val="PageNumber"/>
+        <w:rFonts w:cs="Times New Roman" w:ascii="Times New Roman" w:hAnsi="Times New Roman"/>
         <w:sz w:val="24"/>
         <w:szCs w:val="24"/>
-        <w:rFonts w:cs="Times New Roman" w:ascii="Times New Roman" w:hAnsi="Times New Roman"/>
       </w:rPr>
       <w:instrText xml:space="preserve"> PAGE </w:instrText>
     </w:r>
     <w:r>
       <w:rPr>
         <w:rStyle w:val="PageNumber"/>
+        <w:rFonts w:cs="Times New Roman" w:ascii="Times New Roman" w:hAnsi="Times New Roman"/>
         <w:sz w:val="24"/>
         <w:szCs w:val="24"/>
-        <w:rFonts w:cs="Times New Roman" w:ascii="Times New Roman" w:hAnsi="Times New Roman"/>
       </w:rPr>
       <w:fldChar w:fldCharType="separate"/>
     </w:r>
     <w:r>
       <w:rPr>
         <w:rStyle w:val="PageNumber"/>
+        <w:rFonts w:cs="Times New Roman" w:ascii="Times New Roman" w:hAnsi="Times New Roman"/>
         <w:sz w:val="24"/>
         <w:szCs w:val="24"/>
-        <w:rFonts w:cs="Times New Roman" w:ascii="Times New Roman" w:hAnsi="Times New Roman"/>
       </w:rPr>
       <w:t>2</w:t>
     </w:r>
     <w:r>
       <w:rPr>
         <w:rStyle w:val="PageNumber"/>
+        <w:rFonts w:cs="Times New Roman" w:ascii="Times New Roman" w:hAnsi="Times New Roman"/>
         <w:sz w:val="24"/>
         <w:szCs w:val="24"/>
-        <w:rFonts w:cs="Times New Roman" w:ascii="Times New Roman" w:hAnsi="Times New Roman"/>
       </w:rPr>
       <w:fldChar w:fldCharType="end"/>
     </w:r>
@@ -3701,7 +3698,6 @@
     </w:pPr>
     <w:r>
       <w:rPr>
-        <w:rFonts w:eastAsia=".VnTime"/>
         <w:sz w:val="20"/>
       </w:rPr>
       <w:t xml:space="preserve"> </w:t>
@@ -3714,7 +3710,7 @@
         <wp:inline distT="0" distB="0" distL="0" distR="0">
           <wp:extent cx="1391285" cy="428625"/>
           <wp:effectExtent l="0" t="0" r="0" b="0"/>
-          <wp:docPr id="2" name="Image1" descr=""/>
+          <wp:docPr id="2" name="Image1"/>
           <wp:cNvGraphicFramePr>
             <a:graphicFrameLocks xmlns:a="http://schemas.openxmlformats.org/drawingml/2006/main" noChangeAspect="1"/>
           </wp:cNvGraphicFramePr>
@@ -3722,7 +3718,7 @@
             <a:graphicData uri="http://schemas.openxmlformats.org/drawingml/2006/picture">
               <pic:pic xmlns:pic="http://schemas.openxmlformats.org/drawingml/2006/picture">
                 <pic:nvPicPr>
-                  <pic:cNvPr id="2" name="Image1" descr=""/>
+                  <pic:cNvPr id="2" name="Image1"/>
                   <pic:cNvPicPr>
                     <a:picLocks noChangeAspect="1" noChangeArrowheads="1"/>
                   </pic:cNvPicPr>
@@ -3752,7 +3748,6 @@
     </w:r>
     <w:r>
       <w:rPr>
-        <w:rFonts w:eastAsia=".VnTime"/>
         <w:sz w:val="20"/>
       </w:rPr>
       <w:t xml:space="preserve">                                                                                                             </w:t>
@@ -3772,7 +3767,6 @@
       <w:pStyle w:val="Header"/>
       <w:rPr>
         <w:rFonts w:ascii="Times New Roman" w:hAnsi="Times New Roman" w:cs="Times New Roman"/>
-        <w:i/>
         <w:i/>
         <w:sz w:val="20"/>
         <w:szCs w:val="20"/>
@@ -3797,12 +3791,12 @@
       <w:start w:val="1"/>
       <w:numFmt w:val="decimal"/>
       <w:lvlText w:val="%1."/>
-      <w:lvlJc w:val="left"/>
+      <w:lvlJc w:val="start"/>
       <w:pPr>
         <w:tabs>
           <w:tab w:val="num" w:pos="360"/>
         </w:tabs>
-        <w:ind w:left="360" w:hanging="360"/>
+        <w:ind w:start="360" w:hanging="360"/>
       </w:pPr>
     </w:lvl>
   </w:abstractNum>
@@ -3811,12 +3805,12 @@
       <w:start w:val="1"/>
       <w:numFmt w:val="upperRoman"/>
       <w:lvlText w:val="%1."/>
-      <w:lvlJc w:val="left"/>
+      <w:lvlJc w:val="start"/>
       <w:pPr>
         <w:tabs>
           <w:tab w:val="num" w:pos="360"/>
         </w:tabs>
-        <w:ind w:left="360" w:hanging="0"/>
+        <w:ind w:start="360" w:hanging="0"/>
       </w:pPr>
       <w:rPr/>
     </w:lvl>
@@ -3826,12 +3820,12 @@
       <w:start w:val="18"/>
       <w:numFmt w:val="bullet"/>
       <w:lvlText w:val="-"/>
-      <w:lvlJc w:val="left"/>
+      <w:lvlJc w:val="start"/>
       <w:pPr>
         <w:tabs>
           <w:tab w:val="num" w:pos="360"/>
         </w:tabs>
-        <w:ind w:left="360" w:hanging="360"/>
+        <w:ind w:start="360" w:hanging="360"/>
       </w:pPr>
       <w:rPr>
         <w:rFonts w:ascii="Times New Roman" w:hAnsi="Times New Roman" w:cs="Times New Roman" w:hint="default"/>
@@ -3844,12 +3838,12 @@
       <w:numFmt w:val="none"/>
       <w:suff w:val="nothing"/>
       <w:lvlText w:val=""/>
-      <w:lvlJc w:val="left"/>
+      <w:lvlJc w:val="start"/>
       <w:pPr>
         <w:tabs>
           <w:tab w:val="num" w:pos="0"/>
         </w:tabs>
-        <w:ind w:left="0" w:hanging="0"/>
+        <w:ind w:start="0" w:hanging="0"/>
       </w:pPr>
     </w:lvl>
     <w:lvl w:ilvl="1">
@@ -3857,12 +3851,12 @@
       <w:numFmt w:val="none"/>
       <w:suff w:val="nothing"/>
       <w:lvlText w:val=""/>
-      <w:lvlJc w:val="left"/>
+      <w:lvlJc w:val="start"/>
       <w:pPr>
         <w:tabs>
           <w:tab w:val="num" w:pos="0"/>
         </w:tabs>
-        <w:ind w:left="0" w:hanging="0"/>
+        <w:ind w:start="0" w:hanging="0"/>
       </w:pPr>
     </w:lvl>
     <w:lvl w:ilvl="2">
@@ -3870,12 +3864,12 @@
       <w:numFmt w:val="none"/>
       <w:suff w:val="nothing"/>
       <w:lvlText w:val=""/>
-      <w:lvlJc w:val="left"/>
+      <w:lvlJc w:val="start"/>
       <w:pPr>
         <w:tabs>
           <w:tab w:val="num" w:pos="0"/>
         </w:tabs>
-        <w:ind w:left="0" w:hanging="0"/>
+        <w:ind w:start="0" w:hanging="0"/>
       </w:pPr>
     </w:lvl>
     <w:lvl w:ilvl="3">
@@ -3883,12 +3877,12 @@
       <w:numFmt w:val="none"/>
       <w:suff w:val="nothing"/>
       <w:lvlText w:val=""/>
-      <w:lvlJc w:val="left"/>
+      <w:lvlJc w:val="start"/>
       <w:pPr>
         <w:tabs>
           <w:tab w:val="num" w:pos="0"/>
         </w:tabs>
-        <w:ind w:left="0" w:hanging="0"/>
+        <w:ind w:start="0" w:hanging="0"/>
       </w:pPr>
     </w:lvl>
     <w:lvl w:ilvl="4">
@@ -3896,12 +3890,12 @@
       <w:numFmt w:val="none"/>
       <w:suff w:val="nothing"/>
       <w:lvlText w:val=""/>
-      <w:lvlJc w:val="left"/>
+      <w:lvlJc w:val="start"/>
       <w:pPr>
         <w:tabs>
           <w:tab w:val="num" w:pos="0"/>
         </w:tabs>
-        <w:ind w:left="0" w:hanging="0"/>
+        <w:ind w:start="0" w:hanging="0"/>
       </w:pPr>
     </w:lvl>
     <w:lvl w:ilvl="5">
@@ -3909,12 +3903,12 @@
       <w:numFmt w:val="none"/>
       <w:suff w:val="nothing"/>
       <w:lvlText w:val=""/>
-      <w:lvlJc w:val="left"/>
+      <w:lvlJc w:val="start"/>
       <w:pPr>
         <w:tabs>
           <w:tab w:val="num" w:pos="0"/>
         </w:tabs>
-        <w:ind w:left="0" w:hanging="0"/>
+        <w:ind w:start="0" w:hanging="0"/>
       </w:pPr>
     </w:lvl>
     <w:lvl w:ilvl="6">
@@ -3922,12 +3916,12 @@
       <w:numFmt w:val="none"/>
       <w:suff w:val="nothing"/>
       <w:lvlText w:val=""/>
-      <w:lvlJc w:val="left"/>
+      <w:lvlJc w:val="start"/>
       <w:pPr>
         <w:tabs>
           <w:tab w:val="num" w:pos="0"/>
         </w:tabs>
-        <w:ind w:left="0" w:hanging="0"/>
+        <w:ind w:start="0" w:hanging="0"/>
       </w:pPr>
     </w:lvl>
     <w:lvl w:ilvl="7">
@@ -3935,12 +3929,12 @@
       <w:numFmt w:val="none"/>
       <w:suff w:val="nothing"/>
       <w:lvlText w:val=""/>
-      <w:lvlJc w:val="left"/>
+      <w:lvlJc w:val="start"/>
       <w:pPr>
         <w:tabs>
           <w:tab w:val="num" w:pos="0"/>
         </w:tabs>
-        <w:ind w:left="0" w:hanging="0"/>
+        <w:ind w:start="0" w:hanging="0"/>
       </w:pPr>
     </w:lvl>
     <w:lvl w:ilvl="8">
@@ -3948,12 +3942,12 @@
       <w:numFmt w:val="none"/>
       <w:suff w:val="nothing"/>
       <w:lvlText w:val=""/>
-      <w:lvlJc w:val="left"/>
+      <w:lvlJc w:val="start"/>
       <w:pPr>
         <w:tabs>
           <w:tab w:val="num" w:pos="0"/>
         </w:tabs>
-        <w:ind w:left="0" w:hanging="0"/>
+        <w:ind w:start="0" w:hanging="0"/>
       </w:pPr>
     </w:lvl>
   </w:abstractNum>
@@ -3983,7 +3977,7 @@
   <w:docDefaults>
     <w:rPrDefault>
       <w:rPr>
-        <w:rFonts w:ascii="Liberation Serif" w:hAnsi="Liberation Serif" w:eastAsia="Noto Serif CJK SC" w:cs="Lohit Devanagari"/>
+        <w:rFonts w:ascii="Liberation Serif" w:hAnsi="Liberation Serif" w:eastAsia="Noto Sans" w:cs="Noto Sans"/>
         <w:sz w:val="24"/>
         <w:szCs w:val="24"/>
         <w:lang w:val="en-US" w:eastAsia="zh-CN" w:bidi="hi-IN"/>
@@ -4007,7 +4001,7 @@
       <w:color w:val="auto"/>
       <w:sz w:val="28"/>
       <w:szCs w:val="28"/>
-      <w:lang w:val="en-US" w:bidi="ar-SA" w:eastAsia="zh-CN"/>
+      <w:lang w:bidi="ar-SA" w:val="en-US" w:eastAsia="zh-CN"/>
     </w:rPr>
   </w:style>
   <w:style w:type="character" w:styleId="WW8Num2z0">
@@ -4050,7 +4044,7 @@
       <w:spacing w:before="240" w:after="120"/>
     </w:pPr>
     <w:rPr>
-      <w:rFonts w:ascii="Liberation Sans" w:hAnsi="Liberation Sans" w:eastAsia="Noto Sans CJK SC" w:cs="Lohit Devanagari"/>
+      <w:rFonts w:ascii="Liberation Sans" w:hAnsi="Liberation Sans" w:eastAsia="Noto Sans" w:cs="Noto Sans"/>
       <w:sz w:val="28"/>
       <w:szCs w:val="28"/>
     </w:rPr>
@@ -4067,9 +4061,7 @@
     <w:name w:val="List"/>
     <w:basedOn w:val="BodyText"/>
     <w:pPr/>
-    <w:rPr>
-      <w:rFonts w:cs="Lohit Devanagari"/>
-    </w:rPr>
+    <w:rPr/>
   </w:style>
   <w:style w:type="paragraph" w:styleId="Caption">
     <w:name w:val="caption"/>
@@ -4080,7 +4072,6 @@
       <w:spacing w:before="120" w:after="120"/>
     </w:pPr>
     <w:rPr>
-      <w:rFonts w:cs="Lohit Devanagari"/>
       <w:i/>
       <w:iCs/>
       <w:sz w:val="24"/>
@@ -4094,9 +4085,7 @@
     <w:pPr>
       <w:suppressLineNumbers/>
     </w:pPr>
-    <w:rPr>
-      <w:rFonts w:cs="Lohit Devanagari"/>
-    </w:rPr>
+    <w:rPr/>
   </w:style>
   <w:style w:type="paragraph" w:styleId="PHAN">
     <w:name w:val="PHAN"/>
@@ -4233,37 +4222,37 @@
         <a:srgbClr val="000000"/>
       </a:dk1>
       <a:lt1>
-        <a:srgbClr val="ffffff"/>
+        <a:srgbClr val="FFFFFF"/>
       </a:lt1>
       <a:dk2>
         <a:srgbClr val="000000"/>
       </a:dk2>
       <a:lt2>
-        <a:srgbClr val="ffffff"/>
+        <a:srgbClr val="FFFFFF"/>
       </a:lt2>
       <a:accent1>
-        <a:srgbClr val="18a303"/>
+        <a:srgbClr val="18A303"/>
       </a:accent1>
       <a:accent2>
-        <a:srgbClr val="0369a3"/>
+        <a:srgbClr val="0369A3"/>
       </a:accent2>
       <a:accent3>
-        <a:srgbClr val="a33e03"/>
+        <a:srgbClr val="A33E03"/>
       </a:accent3>
       <a:accent4>
-        <a:srgbClr val="8e03a3"/>
+        <a:srgbClr val="8E03A3"/>
       </a:accent4>
       <a:accent5>
-        <a:srgbClr val="c99c00"/>
+        <a:srgbClr val="C99C00"/>
       </a:accent5>
       <a:accent6>
-        <a:srgbClr val="c9211e"/>
+        <a:srgbClr val="C9211E"/>
       </a:accent6>
       <a:hlink>
-        <a:srgbClr val="0000ee"/>
+        <a:srgbClr val="0000EE"/>
       </a:hlink>
       <a:folHlink>
-        <a:srgbClr val="551a8b"/>
+        <a:srgbClr val="551A8B"/>
       </a:folHlink>
     </a:clrScheme>
     <a:fontScheme name="Office">

</xml_diff>